<commit_message>
Profile "standard": justified text, 1.25 cm first-line indent
Body styles get the indent and justification; headings, captions,
lists, bibliography and equations explicitly do not. Theme font and
color attributes are stripped from pandoc's heading styles, which
otherwise override the explicit Times New Roman and black. Abstract
Title is treated as a heading (black, centered).

Co-Authored-By: Claude Fable 5.1 <noreply@anthropic.com>
Claude-Session: https://claude.ai/code/session_01LPGNxq9AMwXEvGL5ZGZ6wU
</commit_message>
<xml_diff>
--- a/src/tex2docx/data/reference-standard.docx
+++ b/src/tex2docx/data/reference-standard.docx
@@ -566,6 +566,8 @@
     <w:qFormat/>
     <w:pPr>
       <w:spacing w:before="0" w:after="0" w:line="360" w:lineRule="auto"/>
+      <w:ind w:firstLine="709"/>
+      <w:jc w:val="both"/>
     </w:pPr>
     <w:rPr>
       <w:rFonts w:ascii="Times New Roman" w:hAnsi="Times New Roman" w:eastAsia="Times New Roman" w:cs="Times New Roman"/>
@@ -578,6 +580,8 @@
     <w:link w:val="BodyTextChar"/>
     <w:pPr>
       <w:spacing w:before="0" w:after="0" w:line="360" w:lineRule="auto"/>
+      <w:ind w:firstLine="709"/>
+      <w:jc w:val="both"/>
     </w:pPr>
     <w:qFormat/>
     <w:rPr>
@@ -592,6 +596,8 @@
     <w:qFormat/>
     <w:pPr>
       <w:spacing w:before="0" w:after="0" w:line="360" w:lineRule="auto"/>
+      <w:ind w:firstLine="709"/>
+      <w:jc w:val="both"/>
     </w:pPr>
     <w:rPr>
       <w:rFonts w:ascii="Times New Roman" w:hAnsi="Times New Roman" w:eastAsia="Times New Roman" w:cs="Times New Roman"/>
@@ -604,6 +610,8 @@
     <w:qFormat/>
     <w:pPr>
       <w:spacing w:before="0" w:after="0" w:line="360" w:lineRule="auto"/>
+      <w:ind w:firstLine="0"/>
+      <w:jc w:val="both"/>
     </w:pPr>
     <w:rPr>
       <w:rFonts w:ascii="Times New Roman" w:hAnsi="Times New Roman" w:eastAsia="Times New Roman" w:cs="Times New Roman"/>
@@ -619,10 +627,11 @@
       <w:keepNext/>
       <w:keepLines/>
       <w:spacing w:before="0" w:after="0" w:line="360" w:lineRule="auto"/>
+      <w:ind w:firstLine="0"/>
       <w:jc w:val="center"/>
     </w:pPr>
     <w:rPr>
-      <w:rFonts w:asciiTheme="majorHAnsi" w:eastAsiaTheme="majorEastAsia" w:hAnsiTheme="majorHAnsi" w:cstheme="majorBidi" w:ascii="Times New Roman" w:hAnsi="Times New Roman" w:eastAsia="Times New Roman" w:cs="Times New Roman"/>
+      <w:rFonts w:ascii="Times New Roman" w:hAnsi="Times New Roman" w:eastAsia="Times New Roman" w:cs="Times New Roman"/>
       <w:b/>
       <w:bCs/>
       <w:color w:val="000000"/>
@@ -639,6 +648,7 @@
       <w:keepNext/>
       <w:keepLines/>
       <w:spacing w:before="0" w:after="0" w:line="360" w:lineRule="auto"/>
+      <w:ind w:firstLine="0"/>
       <w:jc w:val="center"/>
     </w:pPr>
     <w:rPr>
@@ -657,6 +667,7 @@
       <w:keepNext/>
       <w:keepLines/>
       <w:spacing w:before="0" w:after="0" w:line="360" w:lineRule="auto"/>
+      <w:ind w:firstLine="0"/>
       <w:jc w:val="center"/>
     </w:pPr>
     <w:rPr>
@@ -674,6 +685,7 @@
       <w:keepNext/>
       <w:keepLines/>
       <w:spacing w:before="0" w:after="0" w:line="360" w:lineRule="auto"/>
+      <w:ind w:firstLine="0"/>
       <w:jc w:val="center"/>
     </w:pPr>
     <w:rPr>
@@ -691,16 +703,16 @@
     <w:pPr>
       <w:keepNext/>
       <w:keepLines/>
+      <w:ind w:firstLine="0"/>
       <w:jc w:val="center"/>
       <w:spacing w:before="0" w:after="0" w:line="360" w:lineRule="auto"/>
     </w:pPr>
     <w:rPr>
+      <w:color w:val="000000"/>
       <w:sz w:val="28"/>
       <w:szCs w:val="20"/>
       <w:rFonts w:ascii="Times New Roman" w:hAnsi="Times New Roman" w:eastAsia="Times New Roman" w:cs="Times New Roman"/>
       <w:b/>
-      <w:color w:val="345A8A"/>
-      &gt;
     </w:rPr>
   </w:style>
   <w:style w:type="paragraph" w:customStyle="1" w:styleId="Abstract">
@@ -726,6 +738,8 @@
     <w:qFormat/>
     <w:pPr>
       <w:spacing w:before="0" w:after="0" w:line="360" w:lineRule="auto"/>
+      <w:ind w:firstLine="0"/>
+      <w:jc w:val="both"/>
     </w:pPr>
     <w:rPr>
       <w:rFonts w:ascii="Times New Roman" w:hAnsi="Times New Roman" w:eastAsia="Times New Roman" w:cs="Times New Roman"/>
@@ -742,10 +756,12 @@
       <w:keepNext/>
       <w:keepLines/>
       <w:spacing w:before="0" w:after="0" w:line="360" w:lineRule="auto"/>
+      <w:ind w:firstLine="0"/>
+      <w:jc w:val="left"/>
       <w:outlineLvl w:val="0"/>
     </w:pPr>
     <w:rPr>
-      <w:rFonts w:asciiTheme="majorHAnsi" w:eastAsiaTheme="majorEastAsia" w:hAnsiTheme="majorHAnsi" w:cstheme="majorBidi" w:ascii="Times New Roman" w:hAnsi="Times New Roman" w:eastAsia="Times New Roman" w:cs="Times New Roman"/>
+      <w:rFonts w:ascii="Times New Roman" w:hAnsi="Times New Roman" w:eastAsia="Times New Roman" w:cs="Times New Roman"/>
       <w:b/>
       <w:bCs/>
       <w:color w:val="000000"/>
@@ -764,10 +780,12 @@
       <w:keepNext/>
       <w:keepLines/>
       <w:spacing w:before="0" w:after="0" w:line="360" w:lineRule="auto"/>
+      <w:ind w:firstLine="0"/>
+      <w:jc w:val="left"/>
       <w:outlineLvl w:val="1"/>
     </w:pPr>
     <w:rPr>
-      <w:rFonts w:asciiTheme="majorHAnsi" w:eastAsiaTheme="majorEastAsia" w:hAnsiTheme="majorHAnsi" w:cstheme="majorBidi" w:ascii="Times New Roman" w:hAnsi="Times New Roman" w:eastAsia="Times New Roman" w:cs="Times New Roman"/>
+      <w:rFonts w:ascii="Times New Roman" w:hAnsi="Times New Roman" w:eastAsia="Times New Roman" w:cs="Times New Roman"/>
       <w:b/>
       <w:bCs/>
       <w:color w:val="000000"/>
@@ -786,10 +804,12 @@
       <w:keepNext/>
       <w:keepLines/>
       <w:spacing w:before="0" w:after="0" w:line="360" w:lineRule="auto"/>
+      <w:ind w:firstLine="0"/>
+      <w:jc w:val="left"/>
       <w:outlineLvl w:val="2"/>
     </w:pPr>
     <w:rPr>
-      <w:rFonts w:asciiTheme="majorHAnsi" w:eastAsiaTheme="majorEastAsia" w:hAnsiTheme="majorHAnsi" w:cstheme="majorBidi" w:ascii="Times New Roman" w:hAnsi="Times New Roman" w:eastAsia="Times New Roman" w:cs="Times New Roman"/>
+      <w:rFonts w:ascii="Times New Roman" w:hAnsi="Times New Roman" w:eastAsia="Times New Roman" w:cs="Times New Roman"/>
       <w:b/>
       <w:bCs/>
       <w:color w:val="000000"/>
@@ -808,10 +828,12 @@
       <w:keepNext/>
       <w:keepLines/>
       <w:spacing w:before="0" w:after="0" w:line="360" w:lineRule="auto"/>
+      <w:ind w:firstLine="0"/>
+      <w:jc w:val="left"/>
       <w:outlineLvl w:val="3"/>
     </w:pPr>
     <w:rPr>
-      <w:rFonts w:asciiTheme="majorHAnsi" w:eastAsiaTheme="majorEastAsia" w:hAnsiTheme="majorHAnsi" w:cstheme="majorBidi" w:ascii="Times New Roman" w:hAnsi="Times New Roman" w:eastAsia="Times New Roman" w:cs="Times New Roman"/>
+      <w:rFonts w:ascii="Times New Roman" w:hAnsi="Times New Roman" w:eastAsia="Times New Roman" w:cs="Times New Roman"/>
       <w:i/>
       <w:b/>
       <w:bCs/>
@@ -831,10 +853,12 @@
       <w:keepNext/>
       <w:keepLines/>
       <w:spacing w:before="0" w:after="0" w:line="360" w:lineRule="auto"/>
+      <w:ind w:firstLine="0"/>
+      <w:jc w:val="left"/>
       <w:outlineLvl w:val="4"/>
     </w:pPr>
     <w:rPr>
-      <w:rFonts w:asciiTheme="majorHAnsi" w:eastAsiaTheme="majorEastAsia" w:hAnsiTheme="majorHAnsi" w:cstheme="majorBidi" w:ascii="Times New Roman" w:hAnsi="Times New Roman" w:eastAsia="Times New Roman" w:cs="Times New Roman"/>
+      <w:rFonts w:ascii="Times New Roman" w:hAnsi="Times New Roman" w:eastAsia="Times New Roman" w:cs="Times New Roman"/>
       <w:b/>
       <w:iCs/>
       <w:color w:val="000000"/>
@@ -853,10 +877,12 @@
       <w:keepNext/>
       <w:keepLines/>
       <w:spacing w:before="0" w:after="0" w:line="360" w:lineRule="auto"/>
+      <w:ind w:firstLine="0"/>
+      <w:jc w:val="left"/>
       <w:outlineLvl w:val="5"/>
     </w:pPr>
     <w:rPr>
-      <w:rFonts w:asciiTheme="majorHAnsi" w:eastAsiaTheme="majorEastAsia" w:hAnsiTheme="majorHAnsi" w:cstheme="majorBidi" w:ascii="Times New Roman" w:hAnsi="Times New Roman" w:eastAsia="Times New Roman" w:cs="Times New Roman"/>
+      <w:rFonts w:ascii="Times New Roman" w:hAnsi="Times New Roman" w:eastAsia="Times New Roman" w:cs="Times New Roman"/>
       <w:b/>
       <w:color w:val="000000"/>
       <w:sz w:val="28"/>
@@ -874,10 +900,12 @@
       <w:keepNext/>
       <w:keepLines/>
       <w:spacing w:before="0" w:after="0" w:line="360" w:lineRule="auto"/>
+      <w:ind w:firstLine="0"/>
+      <w:jc w:val="left"/>
       <w:outlineLvl w:val="6"/>
     </w:pPr>
     <w:rPr>
-      <w:rFonts w:asciiTheme="majorHAnsi" w:eastAsiaTheme="majorEastAsia" w:hAnsiTheme="majorHAnsi" w:cstheme="majorBidi" w:ascii="Times New Roman" w:hAnsi="Times New Roman" w:eastAsia="Times New Roman" w:cs="Times New Roman"/>
+      <w:rFonts w:ascii="Times New Roman" w:hAnsi="Times New Roman" w:eastAsia="Times New Roman" w:cs="Times New Roman"/>
       <w:b/>
       <w:color w:val="000000"/>
       <w:sz w:val="28"/>
@@ -895,10 +923,12 @@
       <w:keepNext/>
       <w:keepLines/>
       <w:spacing w:before="0" w:after="0" w:line="360" w:lineRule="auto"/>
+      <w:ind w:firstLine="0"/>
+      <w:jc w:val="left"/>
       <w:outlineLvl w:val="7"/>
     </w:pPr>
     <w:rPr>
-      <w:rFonts w:asciiTheme="majorHAnsi" w:eastAsiaTheme="majorEastAsia" w:hAnsiTheme="majorHAnsi" w:cstheme="majorBidi" w:ascii="Times New Roman" w:hAnsi="Times New Roman" w:eastAsia="Times New Roman" w:cs="Times New Roman"/>
+      <w:rFonts w:ascii="Times New Roman" w:hAnsi="Times New Roman" w:eastAsia="Times New Roman" w:cs="Times New Roman"/>
       <w:b/>
       <w:color w:val="000000"/>
       <w:sz w:val="28"/>
@@ -916,10 +946,12 @@
       <w:keepNext/>
       <w:keepLines/>
       <w:spacing w:before="0" w:after="0" w:line="360" w:lineRule="auto"/>
+      <w:ind w:firstLine="0"/>
+      <w:jc w:val="left"/>
       <w:outlineLvl w:val="8"/>
     </w:pPr>
     <w:rPr>
-      <w:rFonts w:asciiTheme="majorHAnsi" w:eastAsiaTheme="majorEastAsia" w:hAnsiTheme="majorHAnsi" w:cstheme="majorBidi" w:ascii="Times New Roman" w:hAnsi="Times New Roman" w:eastAsia="Times New Roman" w:cs="Times New Roman"/>
+      <w:rFonts w:ascii="Times New Roman" w:hAnsi="Times New Roman" w:eastAsia="Times New Roman" w:cs="Times New Roman"/>
       <w:b/>
       <w:color w:val="000000"/>
       <w:sz w:val="28"/>
@@ -1039,6 +1071,8 @@
     <w:pPr>
       <w:keepNext/>
       <w:spacing w:before="0" w:after="0" w:line="360" w:lineRule="auto"/>
+      <w:ind w:firstLine="0"/>
+      <w:jc w:val="center"/>
     </w:pPr>
     <w:rPr>
       <w:rFonts w:ascii="Times New Roman" w:hAnsi="Times New Roman" w:eastAsia="Times New Roman" w:cs="Times New Roman"/>
@@ -1050,6 +1084,8 @@
     <w:basedOn w:val="Caption"/>
     <w:pPr>
       <w:spacing w:before="0" w:after="0" w:line="360" w:lineRule="auto"/>
+      <w:ind w:firstLine="0"/>
+      <w:jc w:val="center"/>
     </w:pPr>
     <w:rPr>
       <w:rFonts w:ascii="Times New Roman" w:hAnsi="Times New Roman" w:eastAsia="Times New Roman" w:cs="Times New Roman"/>
@@ -1175,6 +1211,7 @@
       </w:tabs>
       <w:spacing w:before="0" w:after="0"/>
       <w:ind w:firstLine="0" w:left="0"/>
+      <w:jc w:val="left"/>
     </w:pPr>
   </w:style>
 </w:styles>

</xml_diff>

<commit_message>
Algorithms as editable pseudocode in a box instead of pictures
stages/algorithms.py parses algorithmic/algpseudocode (State, If/ElsIf/
Else, For/ForAll/While/Repeat/Loop, Function/Procedure, Require/Ensure,
Return, Call, Comment; [noend]; [n] line numbering) into one paragraph
per line with markers; filters/algorithms.lua turns them into Word
paragraphs of the new Algorithm style (bordered, consecutive paragraphs
merge into one box; a tab per nesting level) under an "Алгоритм N."
caption numbered from the .aux. Formulas stay native. config
algorithms: text (default) | image.

Co-Authored-By: Claude Fable 5.1 <noreply@anthropic.com>
Claude-Session: https://claude.ai/code/session_01LPGNxq9AMwXEvGL5ZGZ6wU
</commit_message>
<xml_diff>
--- a/src/tex2docx/data/reference-standard.docx
+++ b/src/tex2docx/data/reference-standard.docx
@@ -1174,6 +1174,43 @@
     <w:pPr>
       <w:keepLines/>
       <w:spacing w:before="0" w:after="0"/>
+    </w:pPr>
+  </w:style>
+  <w:style w:type="paragraph" w:customStyle="1" w:styleId="Algorithm">
+    <w:name w:val="Algorithm"/>
+    <w:basedOn w:val="BodyText"/>
+    <w:pPr>
+      <w:keepNext/>
+      <w:keepLines/>
+      <w:tabs>
+        <w:tab w:pos="850" w:val="left"/>
+        <w:tab w:pos="1191" w:val="left"/>
+        <w:tab w:pos="1531" w:val="left"/>
+        <w:tab w:pos="1871" w:val="left"/>
+        <w:tab w:pos="2211" w:val="left"/>
+        <w:tab w:pos="2551" w:val="left"/>
+        <w:tab w:pos="2891" w:val="left"/>
+        <w:tab w:pos="3231" w:val="left"/>
+      </w:tabs>
+      <w:spacing w:before="0" w:after="0"/>
+      <w:ind w:firstLine="0" w:left="0"/>
+      <w:jc w:val="left"/>
+      <w:pBdr>
+        <w:top w:val="single" w:sz="6" w:space="4" w:color="000000"/>
+        <w:left w:val="single" w:sz="6" w:space="4" w:color="000000"/>
+        <w:bottom w:val="single" w:sz="6" w:space="4" w:color="000000"/>
+        <w:right w:val="single" w:sz="6" w:space="4" w:color="000000"/>
+      </w:pBdr>
+    </w:pPr>
+  </w:style>
+  <w:style w:type="paragraph" w:customStyle="1" w:styleId="AlgorithmCaption">
+    <w:name w:val="Algorithm Caption"/>
+    <w:basedOn w:val="BodyText"/>
+    <w:pPr>
+      <w:keepNext/>
+      <w:spacing w:after="0"/>
+      <w:ind w:firstLine="0"/>
+      <w:jc w:val="left"/>
     </w:pPr>
   </w:style>
   <w:style w:type="paragraph" w:customStyle="1" w:styleId="Centered">

</xml_diff>